<commit_message>
Level 5: add lesson build and check tools; add class-size versions to Lessons 3, 5, 6 (#51)
</commit_message>
<xml_diff>
--- a/level5/curriculum/Level5_Lesson3.docx
+++ b/level5/curriculum/Level5_Lesson3.docx
@@ -2418,6 +2418,36 @@
           <w:sz w:val="23"/>
         </w:rPr>
         <w:t xml:space="preserve"> Round 1, then round 2. Stop at 7:18.</w:t>
+      </w:r>
+    </w:p>
+    <w:p>
+      <w:pPr>
+        <w:spacing w:after="80" w:before="0" w:line="288" w:lineRule="auto"/>
+        <w:ind w:left="432" w:hanging="288"/>
+      </w:pPr>
+      <w:r>
+        <w:rPr>
+          <w:b/>
+          <w:color w:val="1B6F7A"/>
+          <w:sz w:val="23"/>
+        </w:rPr>
+        <w:t xml:space="preserve">•  </w:t>
+      </w:r>
+      <w:r>
+        <w:rPr>
+          <w:b/>
+          <w:i w:val="0"/>
+          <w:sz w:val="23"/>
+        </w:rPr>
+        <w:t>Class size.</w:t>
+      </w:r>
+      <w:r>
+        <w:rPr>
+          <w:b w:val="0"/>
+          <w:i w:val="0"/>
+          <w:sz w:val="23"/>
+        </w:rPr>
+        <w:t xml:space="preserve"> 15 learners: 7 pairs + 1 group of 3. 7–8 learners: 3–4 pairs. 5 or fewer: pairs, or one group with you.</w:t>
       </w:r>
     </w:p>
     <w:p>

</xml_diff>